<commit_message>
cruce de afiliaciones 2 acabado
</commit_message>
<xml_diff>
--- a/reports/resumen_mensual.docx
+++ b/reports/resumen_mensual.docx
@@ -1270,21 +1270,64 @@
               <w:right w:val="single" w:sz="4" w:space="0" w:color="auto"/>
             </w:tcBorders>
             <w:shd w:val="clear" w:color="auto" w:fill="auto"/>
-          </w:tcPr>
-          <w:p>
-            <w:pPr>
-              <w:pStyle w:val="Standard"/>
-              <w:tabs>
-                <w:tab w:val="left" w:pos="7200"/>
-              </w:tabs>
-              <w:rPr>
-                <w:rFonts w:ascii="Calibri" w:hAnsi="Calibri"/>
-                <w:color w:val="595959" w:themeColor="text1" w:themeTint="A6"/>
-                <w:sz w:val="16"/>
-                <w:szCs w:val="16"/>
-                <w:lang w:val="es-BO"/>
-              </w:rPr>
-            </w:pPr>
+            <w:vAlign w:val="center"/>
+          </w:tcPr>
+          <w:p>
+            <w:pPr>
+              <w:pStyle w:val="Standard"/>
+              <w:tabs>
+                <w:tab w:val="left" w:pos="7200"/>
+              </w:tabs>
+              <w:jc w:val="center"/>
+              <w:rPr>
+                <w:rFonts w:ascii="Calibri" w:hAnsi="Calibri"/>
+                <w:color w:val="595959" w:themeColor="text1" w:themeTint="A6"/>
+                <w:sz w:val="16"/>
+                <w:szCs w:val="16"/>
+                <w:lang w:val="es-BO"/>
+              </w:rPr>
+            </w:pPr>
+            <w:r>
+              <w:rPr>
+                <w:rFonts w:ascii="Calibri" w:hAnsi="Calibri"/>
+                <w:b/>
+                <w:bCs/>
+                <w:i w:val="0"/>
+                <w:iCs w:val="0"/>
+                <w:color w:val="767171" w:themeColor="background2" w:themeShade="80"/>
+                <w:sz w:val="24"/>
+                <w:lang w:val="es-BO"/>
+              </w:rPr>
+              <w:t>{</w:t>
+            </w:r>
+            <w:proofErr w:type="spellStart"/>
+            <w:r>
+              <w:rPr>
+                <w:rFonts w:ascii="Calibri" w:hAnsi="Calibri"/>
+                <w:b/>
+                <w:bCs/>
+                <w:i w:val="0"/>
+                <w:iCs w:val="0"/>
+                <w:color w:val="767171" w:themeColor="background2" w:themeShade="80"/>
+                <w:sz w:val="24"/>
+                <w:lang w:val="es-BO"/>
+              </w:rPr>
+              <w:t>d.planilla.emp_legal</w:t>
+            </w:r>
+            <w:proofErr w:type="spellEnd"/>
+            <w:r>
+              <w:rPr>
+                <w:rFonts w:ascii="Calibri" w:hAnsi="Calibri"/>
+                <w:b/>
+                <w:bCs/>
+                <w:i w:val="0"/>
+                <w:iCs w:val="0"/>
+                <w:color w:val="767171" w:themeColor="background2" w:themeShade="80"/>
+                <w:sz w:val="24"/>
+                <w:lang w:val="es-BO"/>
+              </w:rPr>
+              <w:t>}</w:t>
+            </w:r>
           </w:p>
         </w:tc>
         <w:tc>
@@ -1425,70 +1468,6 @@
               <w:t>NOMBRE DEL REP LEGAL</w:t>
             </w:r>
           </w:p>
-          <w:p>
-            <w:pPr>
-              <w:pStyle w:val="Standard"/>
-              <w:tabs>
-                <w:tab w:val="left" w:pos="7200"/>
-              </w:tabs>
-              <w:jc w:val="center"/>
-              <w:rPr>
-                <w:rFonts w:ascii="Calibri" w:hAnsi="Calibri"/>
-                <w:b/>
-                <w:bCs/>
-                <w:i w:val="0"/>
-                <w:iCs w:val="0"/>
-                <w:color w:val="595959" w:themeColor="text1" w:themeTint="A6"/>
-                <w:sz w:val="16"/>
-                <w:szCs w:val="16"/>
-                <w:lang w:val="es-BO"/>
-              </w:rPr>
-            </w:pPr>
-            <w:r>
-              <w:rPr>
-                <w:rFonts w:ascii="Calibri" w:hAnsi="Calibri"/>
-                <w:b/>
-                <w:bCs/>
-                <w:i w:val="0"/>
-                <w:iCs w:val="0"/>
-                <w:color w:val="auto"/>
-                <w:sz w:val="16"/>
-                <w:szCs w:val="16"/>
-                <w:lang w:val="es-BO"/>
-              </w:rPr>
-              <w:t>{</w:t>
-            </w:r>
-            <w:proofErr w:type="spellStart"/>
-            <w:r>
-              <w:rPr>
-                <w:rFonts w:ascii="Calibri" w:hAnsi="Calibri"/>
-                <w:b/>
-                <w:bCs/>
-                <w:i w:val="0"/>
-                <w:iCs w:val="0"/>
-                <w:color w:val="auto"/>
-                <w:sz w:val="16"/>
-                <w:szCs w:val="16"/>
-                <w:lang w:val="es-BO"/>
-              </w:rPr>
-              <w:t>d.planilla.emp_legal</w:t>
-            </w:r>
-            <w:proofErr w:type="spellEnd"/>
-            <w:r>
-              <w:rPr>
-                <w:rFonts w:ascii="Calibri" w:hAnsi="Calibri"/>
-                <w:b/>
-                <w:bCs/>
-                <w:i w:val="0"/>
-                <w:iCs w:val="0"/>
-                <w:color w:val="auto"/>
-                <w:sz w:val="16"/>
-                <w:szCs w:val="16"/>
-                <w:lang w:val="es-BO"/>
-              </w:rPr>
-              <w:t>}</w:t>
-            </w:r>
-          </w:p>
         </w:tc>
         <w:tc>
           <w:tcPr>
@@ -1532,25 +1511,6 @@
               </w:rPr>
               <w:t>N° CARNET</w:t>
             </w:r>
-          </w:p>
-          <w:p>
-            <w:pPr>
-              <w:pStyle w:val="Standard"/>
-              <w:tabs>
-                <w:tab w:val="left" w:pos="7200"/>
-              </w:tabs>
-              <w:jc w:val="center"/>
-              <w:cnfStyle w:val="000000100000" w:firstRow="0" w:lastRow="0" w:firstColumn="0" w:lastColumn="0" w:oddVBand="0" w:evenVBand="0" w:oddHBand="1" w:evenHBand="0" w:firstRowFirstColumn="0" w:firstRowLastColumn="0" w:lastRowFirstColumn="0" w:lastRowLastColumn="0"/>
-              <w:rPr>
-                <w:rFonts w:ascii="Calibri" w:hAnsi="Calibri"/>
-                <w:b/>
-                <w:bCs/>
-                <w:color w:val="595959" w:themeColor="text1" w:themeTint="A6"/>
-                <w:sz w:val="16"/>
-                <w:szCs w:val="16"/>
-                <w:lang w:val="es-BO"/>
-              </w:rPr>
-            </w:pPr>
           </w:p>
         </w:tc>
         <w:tc>
@@ -3135,6 +3095,7 @@
           <w:tcPr>
             <w:tcW w:w="2977" w:type="dxa"/>
             <w:gridSpan w:val="2"/>
+            <w:vAlign w:val="center"/>
           </w:tcPr>
           <w:p>
             <w:pPr>
@@ -3153,6 +3114,50 @@
                 <w:lang w:val="es-BO"/>
               </w:rPr>
             </w:pPr>
+            <w:r>
+              <w:rPr>
+                <w:rFonts w:ascii="Calibri" w:hAnsi="Calibri"/>
+                <w:b/>
+                <w:bCs/>
+                <w:color w:val="767171" w:themeColor="background2" w:themeShade="80"/>
+                <w:lang w:val="es-BO"/>
+              </w:rPr>
+              <w:t>{</w:t>
+            </w:r>
+            <w:proofErr w:type="spellStart"/>
+            <w:proofErr w:type="gramStart"/>
+            <w:r>
+              <w:rPr>
+                <w:rFonts w:ascii="Calibri" w:hAnsi="Calibri"/>
+                <w:b/>
+                <w:bCs/>
+                <w:color w:val="767171" w:themeColor="background2" w:themeShade="80"/>
+                <w:lang w:val="es-BO"/>
+              </w:rPr>
+              <w:t>d.planilla</w:t>
+            </w:r>
+            <w:proofErr w:type="gramEnd"/>
+            <w:r>
+              <w:rPr>
+                <w:rFonts w:ascii="Calibri" w:hAnsi="Calibri"/>
+                <w:b/>
+                <w:bCs/>
+                <w:color w:val="767171" w:themeColor="background2" w:themeShade="80"/>
+                <w:lang w:val="es-BO"/>
+              </w:rPr>
+              <w:t>.valido_cotizacion</w:t>
+            </w:r>
+            <w:proofErr w:type="spellEnd"/>
+            <w:r>
+              <w:rPr>
+                <w:rFonts w:ascii="Calibri" w:hAnsi="Calibri"/>
+                <w:b/>
+                <w:bCs/>
+                <w:color w:val="767171" w:themeColor="background2" w:themeShade="80"/>
+                <w:lang w:val="es-BO"/>
+              </w:rPr>
+              <w:t>}</w:t>
+            </w:r>
           </w:p>
         </w:tc>
         <w:tc>
@@ -3223,23 +3228,41 @@
                 <w:b/>
                 <w:bCs/>
                 <w:color w:val="595959" w:themeColor="text1" w:themeTint="A6"/>
-                <w:sz w:val="16"/>
-                <w:szCs w:val="16"/>
-                <w:lang w:val="es-BO"/>
-              </w:rPr>
-            </w:pPr>
-            <w:r>
-              <w:rPr>
-                <w:rFonts w:ascii="Calibri" w:hAnsi="Calibri"/>
-                <w:b/>
-                <w:bCs/>
-                <w:color w:val="595959" w:themeColor="text1" w:themeTint="A6"/>
-                <w:sz w:val="16"/>
-                <w:szCs w:val="16"/>
+                <w:sz w:val="18"/>
+                <w:szCs w:val="18"/>
+                <w:lang w:val="es-BO"/>
+              </w:rPr>
+            </w:pPr>
+            <w:r>
+              <w:rPr>
+                <w:rFonts w:ascii="Calibri" w:hAnsi="Calibri"/>
+                <w:b/>
+                <w:bCs/>
+                <w:color w:val="595959" w:themeColor="text1" w:themeTint="A6"/>
+                <w:sz w:val="18"/>
+                <w:szCs w:val="18"/>
                 <w:lang w:val="es-BO"/>
               </w:rPr>
               <w:t>LIQUIDADO POR</w:t>
             </w:r>
+          </w:p>
+          <w:p>
+            <w:pPr>
+              <w:pStyle w:val="Standard"/>
+              <w:tabs>
+                <w:tab w:val="left" w:pos="7200"/>
+              </w:tabs>
+              <w:jc w:val="center"/>
+              <w:rPr>
+                <w:rFonts w:ascii="Calibri" w:hAnsi="Calibri"/>
+                <w:b/>
+                <w:bCs/>
+                <w:color w:val="595959" w:themeColor="text1" w:themeTint="A6"/>
+                <w:sz w:val="18"/>
+                <w:szCs w:val="18"/>
+                <w:lang w:val="es-BO"/>
+              </w:rPr>
+            </w:pPr>
           </w:p>
         </w:tc>
         <w:tc>
@@ -3260,34 +3283,22 @@
                 <w:b/>
                 <w:bCs/>
                 <w:color w:val="595959" w:themeColor="text1" w:themeTint="A6"/>
-                <w:sz w:val="16"/>
-                <w:szCs w:val="16"/>
-                <w:lang w:val="es-BO"/>
-              </w:rPr>
-            </w:pPr>
-            <w:r>
-              <w:rPr>
-                <w:rFonts w:ascii="Calibri" w:hAnsi="Calibri"/>
-                <w:b/>
-                <w:bCs/>
-                <w:color w:val="595959" w:themeColor="text1" w:themeTint="A6"/>
-                <w:sz w:val="16"/>
-                <w:szCs w:val="16"/>
-                <w:lang w:val="es-BO"/>
-              </w:rPr>
-              <w:t xml:space="preserve">FIRMA Y SELLO </w:t>
-            </w:r>
-            <w:r>
-              <w:rPr>
-                <w:rFonts w:ascii="Calibri" w:hAnsi="Calibri"/>
-                <w:b/>
-                <w:bCs/>
-                <w:color w:val="595959" w:themeColor="text1" w:themeTint="A6"/>
-                <w:sz w:val="16"/>
-                <w:szCs w:val="16"/>
-                <w:lang w:val="es-BO"/>
-              </w:rPr>
-              <w:t>FIRMA</w:t>
+                <w:sz w:val="18"/>
+                <w:szCs w:val="18"/>
+                <w:lang w:val="es-BO"/>
+              </w:rPr>
+            </w:pPr>
+            <w:r>
+              <w:rPr>
+                <w:rFonts w:ascii="Calibri" w:hAnsi="Calibri"/>
+                <w:b/>
+                <w:bCs/>
+                <w:color w:val="595959" w:themeColor="text1" w:themeTint="A6"/>
+                <w:sz w:val="18"/>
+                <w:szCs w:val="18"/>
+                <w:lang w:val="es-BO"/>
+              </w:rPr>
+              <w:t>FIRMA Y SELLO FIRMA</w:t>
             </w:r>
           </w:p>
         </w:tc>
@@ -3309,22 +3320,92 @@
                 <w:b/>
                 <w:bCs/>
                 <w:color w:val="595959" w:themeColor="text1" w:themeTint="A6"/>
-                <w:sz w:val="16"/>
-                <w:szCs w:val="16"/>
-                <w:lang w:val="es-BO"/>
-              </w:rPr>
-            </w:pPr>
-            <w:r>
-              <w:rPr>
-                <w:rFonts w:ascii="Calibri" w:hAnsi="Calibri"/>
-                <w:b/>
-                <w:bCs/>
-                <w:color w:val="595959" w:themeColor="text1" w:themeTint="A6"/>
-                <w:sz w:val="16"/>
-                <w:szCs w:val="16"/>
+                <w:sz w:val="18"/>
+                <w:szCs w:val="18"/>
+                <w:lang w:val="es-BO"/>
+              </w:rPr>
+            </w:pPr>
+            <w:r>
+              <w:rPr>
+                <w:rFonts w:ascii="Calibri" w:hAnsi="Calibri"/>
+                <w:b/>
+                <w:bCs/>
+                <w:color w:val="595959" w:themeColor="text1" w:themeTint="A6"/>
+                <w:sz w:val="18"/>
+                <w:szCs w:val="18"/>
                 <w:lang w:val="es-BO"/>
               </w:rPr>
               <w:t>LUGAR Y FECHA</w:t>
+            </w:r>
+          </w:p>
+          <w:p>
+            <w:pPr>
+              <w:pStyle w:val="Standard"/>
+              <w:tabs>
+                <w:tab w:val="left" w:pos="7200"/>
+              </w:tabs>
+              <w:jc w:val="center"/>
+              <w:rPr>
+                <w:rFonts w:ascii="Calibri" w:hAnsi="Calibri"/>
+                <w:b/>
+                <w:bCs/>
+                <w:color w:val="595959" w:themeColor="text1" w:themeTint="A6"/>
+                <w:sz w:val="18"/>
+                <w:szCs w:val="18"/>
+                <w:lang w:val="es-BO"/>
+              </w:rPr>
+            </w:pPr>
+            <w:r>
+              <w:rPr>
+                <w:rFonts w:ascii="Calibri" w:hAnsi="Calibri"/>
+                <w:b/>
+                <w:bCs/>
+                <w:color w:val="767171" w:themeColor="background2" w:themeShade="80"/>
+                <w:sz w:val="18"/>
+                <w:szCs w:val="18"/>
+                <w:lang w:val="es-BO"/>
+              </w:rPr>
+              <w:t>La Paz, {</w:t>
+            </w:r>
+            <w:proofErr w:type="spellStart"/>
+            <w:proofErr w:type="gramStart"/>
+            <w:r>
+              <w:rPr>
+                <w:rFonts w:ascii="Calibri" w:hAnsi="Calibri"/>
+                <w:b/>
+                <w:bCs/>
+                <w:color w:val="767171" w:themeColor="background2" w:themeShade="80"/>
+                <w:sz w:val="18"/>
+                <w:szCs w:val="18"/>
+                <w:lang w:val="es-BO"/>
+              </w:rPr>
+              <w:t>d.planilla</w:t>
+            </w:r>
+            <w:proofErr w:type="gramEnd"/>
+            <w:r>
+              <w:rPr>
+                <w:rFonts w:ascii="Calibri" w:hAnsi="Calibri"/>
+                <w:b/>
+                <w:bCs/>
+                <w:color w:val="767171" w:themeColor="background2" w:themeShade="80"/>
+                <w:sz w:val="18"/>
+                <w:szCs w:val="18"/>
+                <w:lang w:val="es-BO"/>
+              </w:rPr>
+              <w:t>.fecha_liquidacion</w:t>
+            </w:r>
+            <w:proofErr w:type="spellEnd"/>
+            <w:r>
+              <w:rPr>
+                <w:rFonts w:ascii="Calibri" w:hAnsi="Calibri"/>
+                <w:b/>
+                <w:bCs/>
+                <w:color w:val="767171" w:themeColor="background2" w:themeShade="80"/>
+                <w:sz w:val="18"/>
+                <w:szCs w:val="18"/>
+                <w:lang w:val="es-BO"/>
+              </w:rPr>
+              <w:t>}</w:t>
             </w:r>
           </w:p>
         </w:tc>
@@ -3720,7 +3801,7 @@
       </w:tr>
       <w:tr>
         <w:trPr>
-          <w:trHeight w:val="2113"/>
+          <w:trHeight w:val="1775"/>
         </w:trPr>
         <w:tc>
           <w:tcPr>

</xml_diff>